<commit_message>
Add volumetric AI and reorganize cohort outputs by modality.
Optional --with-volume-ai reads dk_nodes.mif for ROI volumes and writes
results under strength/, volume/, and compare/ so connectivity and volume
outputs stay separated.

Co-authored-by: Cursor <cursoragent@cursor.com>
</commit_message>
<xml_diff>
--- a/nodestrength.docx
+++ b/nodestrength.docx
@@ -2653,7 +2653,39 @@
         <w:t>§12</w:t>
       </w:r>
       <w:r>
-        <w:t xml:space="preserve"> for full methodology, sources, and interpretation of the two core per-subject files):</w:t>
+        <w:t xml:space="preserve"> for full methodology, sources, and interpretation). Outputs are grouped by modality:</w:t>
+      </w:r>
+    </w:p>
+    <w:p>
+      <w:pPr>
+        <w:ind w:left="360"/>
+      </w:pPr>
+      <w:r>
+        <w:rPr>
+          <w:rFonts w:ascii="Consolas" w:hAnsi="Consolas"/>
+          <w:sz w:val="18"/>
+        </w:rPr>
+        <w:t>node_strength_results/</w:t>
+        <w:br/>
+        <w:t>├── strength/          # connectivity (always)</w:t>
+        <w:br/>
+        <w:t>│   ├── per_subject/</w:t>
+        <w:br/>
+        <w:t>│   ├── node_strength_cohort.csv</w:t>
+        <w:br/>
+        <w:t>│   ├── asymmetry_index_cohort.csv</w:t>
+        <w:br/>
+        <w:t>│   └── cohort_summary.csv</w:t>
+        <w:br/>
+        <w:t>├── volume/            # optional (--with-volume-ai)</w:t>
+        <w:br/>
+        <w:t>│   ├── per_subject/</w:t>
+        <w:br/>
+        <w:t>│   └── … cohort volume tables</w:t>
+        <w:br/>
+        <w:t>└── compare/           # optional (--with-volume-ai)</w:t>
+        <w:br/>
+        <w:t xml:space="preserve">    └── strength_vs_volume_ai.csv</w:t>
       </w:r>
     </w:p>
     <w:tbl>
@@ -2707,7 +2739,7 @@
                 <w:rFonts w:ascii="Consolas" w:hAnsi="Consolas"/>
                 <w:sz w:val="20"/>
               </w:rPr>
-              <w:t>per_subject/sub-XXX_strength.csv</w:t>
+              <w:t>strength/per_subject/sub-XXX_strength.csv</w:t>
             </w:r>
           </w:p>
         </w:tc>
@@ -2733,7 +2765,7 @@
                 <w:rFonts w:ascii="Consolas" w:hAnsi="Consolas"/>
                 <w:sz w:val="20"/>
               </w:rPr>
-              <w:t>per_subject/sub-XXX_ai.csv</w:t>
+              <w:t>strength/per_subject/sub-XXX_ai.csv</w:t>
             </w:r>
           </w:p>
         </w:tc>
@@ -2743,7 +2775,7 @@
           </w:tcPr>
           <w:p>
             <w:r>
-              <w:t>41 L/R pairs × interhemispheric AI (see §12.2)</w:t>
+              <w:t>42 L/R pairs × interhemispheric AI (see §12.2)</w:t>
             </w:r>
           </w:p>
         </w:tc>
@@ -2759,7 +2791,7 @@
                 <w:rFonts w:ascii="Consolas" w:hAnsi="Consolas"/>
                 <w:sz w:val="20"/>
               </w:rPr>
-              <w:t>node_strength_cohort.csv</w:t>
+              <w:t>strength/node_strength_cohort.csv</w:t>
             </w:r>
           </w:p>
         </w:tc>
@@ -2795,7 +2827,7 @@
                 <w:rFonts w:ascii="Consolas" w:hAnsi="Consolas"/>
                 <w:sz w:val="20"/>
               </w:rPr>
-              <w:t>asymmetry_index_cohort.csv</w:t>
+              <w:t>strength/asymmetry_index_cohort.csv</w:t>
             </w:r>
           </w:p>
         </w:tc>
@@ -2831,7 +2863,7 @@
                 <w:rFonts w:ascii="Consolas" w:hAnsi="Consolas"/>
                 <w:sz w:val="20"/>
               </w:rPr>
-              <w:t>cohort_summary.csv</w:t>
+              <w:t>strength/cohort_summary.csv</w:t>
             </w:r>
           </w:p>
         </w:tc>
@@ -2841,7 +2873,7 @@
           </w:tcPr>
           <w:p>
             <w:r>
-              <w:t xml:space="preserve">Per-ROI mean/SD of </w:t>
+              <w:t xml:space="preserve">Per-ROI mean/SD of strength </w:t>
             </w:r>
             <w:r>
               <w:rPr>
@@ -2859,6 +2891,102 @@
                 <w:sz w:val="20"/>
               </w:rPr>
               <w:t>log_ai</w:t>
+            </w:r>
+          </w:p>
+        </w:tc>
+      </w:tr>
+      <w:tr>
+        <w:tc>
+          <w:tcPr>
+            <w:tcW w:type="dxa" w:w="4320"/>
+          </w:tcPr>
+          <w:p>
+            <w:r>
+              <w:rPr>
+                <w:rFonts w:ascii="Consolas" w:hAnsi="Consolas"/>
+                <w:sz w:val="20"/>
+              </w:rPr>
+              <w:t>volume/per_subject/sub-XXX_volume.csv</w:t>
+            </w:r>
+          </w:p>
+        </w:tc>
+        <w:tc>
+          <w:tcPr>
+            <w:tcW w:type="dxa" w:w="4320"/>
+          </w:tcPr>
+          <w:p>
+            <w:r>
+              <w:t xml:space="preserve">84 nodes × volume_mm3 </w:t>
+            </w:r>
+            <w:r>
+              <w:rPr>
+                <w:i/>
+              </w:rPr>
+              <w:t>(with `--with-volume-ai`)</w:t>
+            </w:r>
+          </w:p>
+        </w:tc>
+      </w:tr>
+      <w:tr>
+        <w:tc>
+          <w:tcPr>
+            <w:tcW w:type="dxa" w:w="4320"/>
+          </w:tcPr>
+          <w:p>
+            <w:r>
+              <w:rPr>
+                <w:rFonts w:ascii="Consolas" w:hAnsi="Consolas"/>
+                <w:sz w:val="20"/>
+              </w:rPr>
+              <w:t>volume/per_subject/sub-XXX_volume_ai.csv</w:t>
+            </w:r>
+          </w:p>
+        </w:tc>
+        <w:tc>
+          <w:tcPr>
+            <w:tcW w:type="dxa" w:w="4320"/>
+          </w:tcPr>
+          <w:p>
+            <w:r>
+              <w:t xml:space="preserve">42 pairs × volume AI </w:t>
+            </w:r>
+            <w:r>
+              <w:rPr>
+                <w:i/>
+              </w:rPr>
+              <w:t>(with `--with-volume-ai`)</w:t>
+            </w:r>
+          </w:p>
+        </w:tc>
+      </w:tr>
+      <w:tr>
+        <w:tc>
+          <w:tcPr>
+            <w:tcW w:type="dxa" w:w="4320"/>
+          </w:tcPr>
+          <w:p>
+            <w:r>
+              <w:rPr>
+                <w:rFonts w:ascii="Consolas" w:hAnsi="Consolas"/>
+                <w:sz w:val="20"/>
+              </w:rPr>
+              <w:t>compare/strength_vs_volume_ai.csv</w:t>
+            </w:r>
+          </w:p>
+        </w:tc>
+        <w:tc>
+          <w:tcPr>
+            <w:tcW w:type="dxa" w:w="4320"/>
+          </w:tcPr>
+          <w:p>
+            <w:r>
+              <w:t xml:space="preserve">Side-by-side strength vs volume AI </w:t>
+            </w:r>
+            <w:r>
+              <w:rPr>
+                <w:i/>
+              </w:rPr>
+              <w:t>(with `--with-volume-ai`)</w:t>
             </w:r>
           </w:p>
         </w:tc>
@@ -2984,7 +3112,7 @@
         <w:t>node_strength_results/</w:t>
       </w:r>
       <w:r>
-        <w:t>:</w:t>
+        <w:t xml:space="preserve"> (strength only by default):</w:t>
       </w:r>
     </w:p>
     <w:p>
@@ -3004,17 +3132,54 @@
         <w:br/>
         <w:t>├── manifest.json</w:t>
         <w:br/>
-        <w:t>├── node_strength_cohort.csv       84 nodes × N subjects</w:t>
+        <w:t>└── strength/</w:t>
         <w:br/>
-        <w:t>├── asymmetry_index_cohort.csv     41 L/R pairs × N subjects</w:t>
+        <w:t xml:space="preserve">    ├── node_strength_cohort.csv       84 nodes × N subjects</w:t>
         <w:br/>
-        <w:t>├── cohort_summary.csv             per-ROI cohort means + SDs</w:t>
+        <w:t xml:space="preserve">    ├── asymmetry_index_cohort.csv     42 L/R pairs × N subjects</w:t>
         <w:br/>
-        <w:t>└── per_subject/</w:t>
+        <w:t xml:space="preserve">    ├── cohort_summary.csv             per-ROI cohort means + SDs</w:t>
         <w:br/>
-        <w:t xml:space="preserve">    ├── sub-XXX_strength.csv</w:t>
+        <w:t xml:space="preserve">    └── per_subject/</w:t>
         <w:br/>
-        <w:t xml:space="preserve">    └── sub-XXX_ai.csv</w:t>
+        <w:t xml:space="preserve">        ├── sub-XXX_strength.csv</w:t>
+        <w:br/>
+        <w:t xml:space="preserve">        └── sub-XXX_ai.csv</w:t>
+      </w:r>
+    </w:p>
+    <w:p>
+      <w:r>
+        <w:t xml:space="preserve">With </w:t>
+      </w:r>
+      <w:r>
+        <w:rPr>
+          <w:rFonts w:ascii="Consolas" w:hAnsi="Consolas"/>
+          <w:sz w:val="20"/>
+        </w:rPr>
+        <w:t>--with-volume-ai</w:t>
+      </w:r>
+      <w:r>
+        <w:t xml:space="preserve">, also creates </w:t>
+      </w:r>
+      <w:r>
+        <w:rPr>
+          <w:rFonts w:ascii="Consolas" w:hAnsi="Consolas"/>
+          <w:sz w:val="20"/>
+        </w:rPr>
+        <w:t>volume/</w:t>
+      </w:r>
+      <w:r>
+        <w:t xml:space="preserve"> and </w:t>
+      </w:r>
+      <w:r>
+        <w:rPr>
+          <w:rFonts w:ascii="Consolas" w:hAnsi="Consolas"/>
+          <w:sz w:val="20"/>
+        </w:rPr>
+        <w:t>compare/</w:t>
+      </w:r>
+      <w:r>
+        <w:t xml:space="preserve"> (see §11.2).</w:t>
       </w:r>
     </w:p>
     <w:p>
@@ -3581,7 +3746,17 @@
     </w:p>
     <w:p>
       <w:r>
-        <w:t>84 DK nodes.</w:t>
+        <w:t xml:space="preserve">84 DK nodes → </w:t>
+      </w:r>
+      <w:r>
+        <w:rPr>
+          <w:rFonts w:ascii="Consolas" w:hAnsi="Consolas"/>
+          <w:sz w:val="20"/>
+        </w:rPr>
+        <w:t>strength/per_subject/sub-XXX_strength.csv</w:t>
+      </w:r>
+      <w:r>
+        <w:t>.</w:t>
       </w:r>
     </w:p>
     <w:p>
@@ -3592,13 +3767,16 @@
         <w:rPr>
           <w:b/>
         </w:rPr>
-        <w:t>Interhemispheric asymmetry index</w:t>
-      </w:r>
-      <w:r>
-        <w:t xml:space="preserve"> — for each of 41 matched L/R pairs:</w:t>
+        <w:t>Interhemispheric asymmetry index (strength)</w:t>
+      </w:r>
+      <w:r>
+        <w:t xml:space="preserve"> — for each of 42 matched L/R</w:t>
       </w:r>
     </w:p>
     <w:p>
+      <w:r>
+        <w:t xml:space="preserve">pairs: </w:t>
+      </w:r>
       <w:r>
         <w:rPr>
           <w:rFonts w:ascii="Consolas" w:hAnsi="Consolas"/>
@@ -3617,6 +3795,71 @@
         <w:t>log_ai = ln(L / R)</w:t>
       </w:r>
       <w:r>
+        <w:t xml:space="preserve"> → </w:t>
+      </w:r>
+      <w:r>
+        <w:rPr>
+          <w:rFonts w:ascii="Consolas" w:hAnsi="Consolas"/>
+          <w:sz w:val="20"/>
+        </w:rPr>
+        <w:t>strength/per_subject/sub-XXX_ai.csv</w:t>
+      </w:r>
+      <w:r>
+        <w:t>.</w:t>
+      </w:r>
+    </w:p>
+    <w:p>
+      <w:pPr>
+        <w:pStyle w:val="ListNumber"/>
+      </w:pPr>
+      <w:r>
+        <w:rPr>
+          <w:b/>
+        </w:rPr>
+        <w:t>Volume + volume AI</w:t>
+      </w:r>
+      <w:r>
+        <w:t xml:space="preserve"> </w:t>
+      </w:r>
+      <w:r>
+        <w:rPr>
+          <w:i/>
+        </w:rPr>
+        <w:t>(optional, `--with-volume-ai`)</w:t>
+      </w:r>
+      <w:r>
+        <w:t xml:space="preserve"> — ROI volume from</w:t>
+      </w:r>
+    </w:p>
+    <w:p>
+      <w:r>
+        <w:rPr>
+          <w:rFonts w:ascii="Consolas" w:hAnsi="Consolas"/>
+          <w:sz w:val="20"/>
+        </w:rPr>
+        <w:t>dk_nodes.mif</w:t>
+      </w:r>
+      <w:r>
+        <w:t xml:space="preserve"> → </w:t>
+      </w:r>
+      <w:r>
+        <w:rPr>
+          <w:rFonts w:ascii="Consolas" w:hAnsi="Consolas"/>
+          <w:sz w:val="20"/>
+        </w:rPr>
+        <w:t>volume/per_subject/</w:t>
+      </w:r>
+      <w:r>
+        <w:t xml:space="preserve">; cross-modality table in </w:t>
+      </w:r>
+      <w:r>
+        <w:rPr>
+          <w:rFonts w:ascii="Consolas" w:hAnsi="Consolas"/>
+          <w:sz w:val="20"/>
+        </w:rPr>
+        <w:t>compare/strength_vs_volume_ai.csv</w:t>
+      </w:r>
+      <w:r>
         <w:t>.</w:t>
       </w:r>
     </w:p>
@@ -3640,7 +3883,7 @@
         <w:pStyle w:val="Heading3"/>
       </w:pPr>
       <w:r>
-        <w:t>11.2 Result locations</w:t>
+        <w:t>11.2 Result locations and folder layout</w:t>
       </w:r>
     </w:p>
     <w:tbl>
@@ -3756,7 +3999,7 @@
           </w:tcPr>
           <w:p>
             <w:r>
-              <w:t>Workflow mirror (same CSV layout)</w:t>
+              <w:t>Workflow mirror (same layout)</w:t>
             </w:r>
           </w:p>
         </w:tc>
@@ -3789,6 +4032,63 @@
       </w:tr>
     </w:tbl>
     <w:p/>
+    <w:p>
+      <w:r>
+        <w:rPr>
+          <w:b/>
+        </w:rPr>
+        <w:t>Output folder structure</w:t>
+      </w:r>
+      <w:r>
+        <w:t xml:space="preserve"> (as of Jul 21, 2026):</w:t>
+      </w:r>
+    </w:p>
+    <w:p>
+      <w:pPr>
+        <w:ind w:left="360"/>
+      </w:pPr>
+      <w:r>
+        <w:rPr>
+          <w:rFonts w:ascii="Consolas" w:hAnsi="Consolas"/>
+          <w:sz w:val="18"/>
+        </w:rPr>
+        <w:t>node_strength_results/</w:t>
+        <w:br/>
+        <w:t>├── README.md, manifest.json, nodestrength.md, nodestrength.docx, …</w:t>
+        <w:br/>
+        <w:t>├── strength/                          # connectivity (always written)</w:t>
+        <w:br/>
+        <w:t>│   ├── per_subject/</w:t>
+        <w:br/>
+        <w:t>│   │   ├── sub-XXX_strength.csv</w:t>
+        <w:br/>
+        <w:t>│   │   └── sub-XXX_ai.csv</w:t>
+        <w:br/>
+        <w:t>│   ├── node_strength_cohort.csv</w:t>
+        <w:br/>
+        <w:t>│   ├── asymmetry_index_cohort.csv</w:t>
+        <w:br/>
+        <w:t>│   └── cohort_summary.csv</w:t>
+        <w:br/>
+        <w:t>├── volume/                            # optional (--with-volume-ai)</w:t>
+        <w:br/>
+        <w:t>│   ├── per_subject/</w:t>
+        <w:br/>
+        <w:t>│   │   ├── sub-XXX_volume.csv</w:t>
+        <w:br/>
+        <w:t>│   │   └── sub-XXX_volume_ai.csv</w:t>
+        <w:br/>
+        <w:t>│   ├── node_volume_cohort.csv</w:t>
+        <w:br/>
+        <w:t>│   ├── volume_asymmetry_index_cohort.csv</w:t>
+        <w:br/>
+        <w:t>│   └── cohort_volume_summary.csv</w:t>
+        <w:br/>
+        <w:t>└── compare/                           # optional (--with-volume-ai)</w:t>
+        <w:br/>
+        <w:t xml:space="preserve">    └── strength_vs_volume_ai.csv</w:t>
+      </w:r>
+    </w:p>
     <w:p>
       <w:r>
         <w:t>SMB equivalents:</w:t>
@@ -4033,7 +4333,17 @@
           </w:tcPr>
           <w:p>
             <w:r>
-              <w:t xml:space="preserve">Done — see </w:t>
+              <w:t xml:space="preserve">Done — </w:t>
+            </w:r>
+            <w:r>
+              <w:rPr>
+                <w:rFonts w:ascii="Consolas" w:hAnsi="Consolas"/>
+                <w:sz w:val="20"/>
+              </w:rPr>
+              <w:t>strength/</w:t>
+            </w:r>
+            <w:r>
+              <w:t xml:space="preserve"> under </w:t>
             </w:r>
             <w:r>
               <w:rPr>
@@ -4052,6 +4362,58 @@
           </w:tcPr>
           <w:p>
             <w:r>
+              <w:t>Volumetric AI</w:t>
+            </w:r>
+          </w:p>
+        </w:tc>
+        <w:tc>
+          <w:tcPr>
+            <w:tcW w:type="dxa" w:w="4320"/>
+          </w:tcPr>
+          <w:p>
+            <w:r>
+              <w:t xml:space="preserve">Done on dwi_test2 — </w:t>
+            </w:r>
+            <w:r>
+              <w:rPr>
+                <w:rFonts w:ascii="Consolas" w:hAnsi="Consolas"/>
+                <w:sz w:val="20"/>
+              </w:rPr>
+              <w:t>volume/</w:t>
+            </w:r>
+            <w:r>
+              <w:t xml:space="preserve"> + </w:t>
+            </w:r>
+            <w:r>
+              <w:rPr>
+                <w:rFonts w:ascii="Consolas" w:hAnsi="Consolas"/>
+                <w:sz w:val="20"/>
+              </w:rPr>
+              <w:t>compare/</w:t>
+            </w:r>
+            <w:r>
+              <w:t xml:space="preserve"> (run with </w:t>
+            </w:r>
+            <w:r>
+              <w:rPr>
+                <w:rFonts w:ascii="Consolas" w:hAnsi="Consolas"/>
+                <w:sz w:val="20"/>
+              </w:rPr>
+              <w:t>--with-volume-ai</w:t>
+            </w:r>
+            <w:r>
+              <w:t>)</w:t>
+            </w:r>
+          </w:p>
+        </w:tc>
+      </w:tr>
+      <w:tr>
+        <w:tc>
+          <w:tcPr>
+            <w:tcW w:type="dxa" w:w="4320"/>
+          </w:tcPr>
+          <w:p>
+            <w:r>
               <w:t>Normative z-scoring</w:t>
             </w:r>
           </w:p>
@@ -4149,28 +4511,6 @@
           <w:p>
             <w:r>
               <w:t>Not run — DK gives whole-thalamus L/R only</w:t>
-            </w:r>
-          </w:p>
-        </w:tc>
-      </w:tr>
-      <w:tr>
-        <w:tc>
-          <w:tcPr>
-            <w:tcW w:type="dxa" w:w="4320"/>
-          </w:tcPr>
-          <w:p>
-            <w:r>
-              <w:t>Volumetric AI</w:t>
-            </w:r>
-          </w:p>
-        </w:tc>
-        <w:tc>
-          <w:tcPr>
-            <w:tcW w:type="dxa" w:w="4320"/>
-          </w:tcPr>
-          <w:p>
-            <w:r>
-              <w:t>Planned optional step — not implemented yet (see §11.7)</w:t>
             </w:r>
           </w:p>
         </w:tc>
@@ -4196,6 +4536,39 @@
         <w:t xml:space="preserve">    --root /mnt/nfs/Gugger_Lab/NIR/dwi_test2/dk_connectomes \</w:t>
         <w:br/>
         <w:t xml:space="preserve">    --out  /mnt/nfs/Gugger_Lab/NIR/dwi_test2/node_strength_results</w:t>
+      </w:r>
+    </w:p>
+    <w:p>
+      <w:r>
+        <w:t xml:space="preserve">Add volumetric AI (requires </w:t>
+      </w:r>
+      <w:r>
+        <w:rPr>
+          <w:rFonts w:ascii="Consolas" w:hAnsi="Consolas"/>
+          <w:sz w:val="20"/>
+        </w:rPr>
+        <w:t>dk_nodes.mif</w:t>
+      </w:r>
+      <w:r>
+        <w:t xml:space="preserve"> per subject):</w:t>
+      </w:r>
+    </w:p>
+    <w:p>
+      <w:pPr>
+        <w:ind w:left="360"/>
+      </w:pPr>
+      <w:r>
+        <w:rPr>
+          <w:rFonts w:ascii="Consolas" w:hAnsi="Consolas"/>
+          <w:sz w:val="18"/>
+        </w:rPr>
+        <w:t>python scripts/run_dk_ai_cohort.py \</w:t>
+        <w:br/>
+        <w:t xml:space="preserve">    --root /mnt/nfs/Gugger_Lab/NIR/dwi_test2/dk_connectomes \</w:t>
+        <w:br/>
+        <w:t xml:space="preserve">    --out  /mnt/nfs/Gugger_Lab/NIR/dwi_test2/node_strength_results \</w:t>
+        <w:br/>
+        <w:t xml:space="preserve">    --with-volume-ai</w:t>
       </w:r>
     </w:p>
     <w:p>
@@ -4223,14 +4596,24 @@
     </w:p>
     <w:p>
       <w:r>
-        <w:t xml:space="preserve">Then merge the new per-subject CSVs into the cohort tables and refresh </w:t>
+        <w:t xml:space="preserve">Then merge the new per-subject CSVs into </w:t>
       </w:r>
       <w:r>
         <w:rPr>
           <w:rFonts w:ascii="Consolas" w:hAnsi="Consolas"/>
           <w:sz w:val="20"/>
         </w:rPr>
-        <w:t>cohort_summary.csv</w:t>
+        <w:t>strength/</w:t>
+      </w:r>
+      <w:r>
+        <w:t xml:space="preserve"> cohort tables and refresh </w:t>
+      </w:r>
+      <w:r>
+        <w:rPr>
+          <w:rFonts w:ascii="Consolas" w:hAnsi="Consolas"/>
+          <w:sz w:val="20"/>
+        </w:rPr>
+        <w:t>strength/cohort_summary.csv</w:t>
       </w:r>
       <w:r>
         <w:t xml:space="preserve"> and </w:t>
@@ -4243,7 +4626,27 @@
         <w:t>manifest.json</w:t>
       </w:r>
       <w:r>
-        <w:t>.</w:t>
+        <w:t xml:space="preserve"> (and </w:t>
+      </w:r>
+      <w:r>
+        <w:rPr>
+          <w:rFonts w:ascii="Consolas" w:hAnsi="Consolas"/>
+          <w:sz w:val="20"/>
+        </w:rPr>
+        <w:t>volume/</w:t>
+      </w:r>
+      <w:r>
+        <w:t xml:space="preserve"> / </w:t>
+      </w:r>
+      <w:r>
+        <w:rPr>
+          <w:rFonts w:ascii="Consolas" w:hAnsi="Consolas"/>
+          <w:sz w:val="20"/>
+        </w:rPr>
+        <w:t>compare/</w:t>
+      </w:r>
+      <w:r>
+        <w:t xml:space="preserve"> if volume AI was enabled).</w:t>
       </w:r>
     </w:p>
     <w:p>
@@ -4263,7 +4666,7 @@
           <w:rFonts w:ascii="Consolas" w:hAnsi="Consolas"/>
           <w:sz w:val="20"/>
         </w:rPr>
-        <w:t>per_subject/</w:t>
+        <w:t>strength/per_subject/</w:t>
       </w:r>
       <w:r>
         <w:t xml:space="preserve">. </w:t>
@@ -4341,7 +4744,7 @@
                 <w:rFonts w:ascii="Consolas" w:hAnsi="Consolas"/>
                 <w:sz w:val="20"/>
               </w:rPr>
-              <w:t>sub-XXX_strength.csv</w:t>
+              <w:t>strength/per_subject/sub-XXX_strength.csv</w:t>
             </w:r>
           </w:p>
         </w:tc>
@@ -4377,7 +4780,7 @@
                 <w:rFonts w:ascii="Consolas" w:hAnsi="Consolas"/>
                 <w:sz w:val="20"/>
               </w:rPr>
-              <w:t>sub-XXX_ai.csv</w:t>
+              <w:t>strength/per_subject/sub-XXX_ai.csv</w:t>
             </w:r>
           </w:p>
         </w:tc>
@@ -4387,7 +4790,7 @@
           </w:tcPr>
           <w:p>
             <w:r>
-              <w:t>41</w:t>
+              <w:t>42</w:t>
             </w:r>
           </w:p>
         </w:tc>
@@ -4398,6 +4801,90 @@
           <w:p>
             <w:r>
               <w:t>Is connectivity left–right asymmetric for each ROI pair?</w:t>
+            </w:r>
+          </w:p>
+        </w:tc>
+      </w:tr>
+      <w:tr>
+        <w:tc>
+          <w:tcPr>
+            <w:tcW w:type="dxa" w:w="2880"/>
+          </w:tcPr>
+          <w:p>
+            <w:r>
+              <w:rPr>
+                <w:rFonts w:ascii="Consolas" w:hAnsi="Consolas"/>
+                <w:sz w:val="20"/>
+              </w:rPr>
+              <w:t>volume/per_subject/sub-XXX_volume.csv</w:t>
+            </w:r>
+          </w:p>
+        </w:tc>
+        <w:tc>
+          <w:tcPr>
+            <w:tcW w:type="dxa" w:w="2880"/>
+          </w:tcPr>
+          <w:p>
+            <w:r>
+              <w:t>84</w:t>
+            </w:r>
+          </w:p>
+        </w:tc>
+        <w:tc>
+          <w:tcPr>
+            <w:tcW w:type="dxa" w:w="2880"/>
+          </w:tcPr>
+          <w:p>
+            <w:r>
+              <w:t xml:space="preserve">What is each DK node's volume (mm³)? </w:t>
+            </w:r>
+            <w:r>
+              <w:rPr>
+                <w:i/>
+              </w:rPr>
+              <w:t>(with `--with-volume-ai`)</w:t>
+            </w:r>
+          </w:p>
+        </w:tc>
+      </w:tr>
+      <w:tr>
+        <w:tc>
+          <w:tcPr>
+            <w:tcW w:type="dxa" w:w="2880"/>
+          </w:tcPr>
+          <w:p>
+            <w:r>
+              <w:rPr>
+                <w:rFonts w:ascii="Consolas" w:hAnsi="Consolas"/>
+                <w:sz w:val="20"/>
+              </w:rPr>
+              <w:t>volume/per_subject/sub-XXX_volume_ai.csv</w:t>
+            </w:r>
+          </w:p>
+        </w:tc>
+        <w:tc>
+          <w:tcPr>
+            <w:tcW w:type="dxa" w:w="2880"/>
+          </w:tcPr>
+          <w:p>
+            <w:r>
+              <w:t>42</w:t>
+            </w:r>
+          </w:p>
+        </w:tc>
+        <w:tc>
+          <w:tcPr>
+            <w:tcW w:type="dxa" w:w="2880"/>
+          </w:tcPr>
+          <w:p>
+            <w:r>
+              <w:t xml:space="preserve">Is volume left–right asymmetric for each ROI pair? </w:t>
+            </w:r>
+            <w:r>
+              <w:rPr>
+                <w:i/>
+              </w:rPr>
+              <w:t>(with `--with-volume-ai`)</w:t>
             </w:r>
           </w:p>
         </w:tc>
@@ -4406,34 +4893,34 @@
     <w:p/>
     <w:p>
       <w:r>
-        <w:t xml:space="preserve">Cohort-level mirrors: </w:t>
+        <w:t xml:space="preserve">Cohort-level mirrors live under </w:t>
       </w:r>
       <w:r>
         <w:rPr>
           <w:rFonts w:ascii="Consolas" w:hAnsi="Consolas"/>
           <w:sz w:val="20"/>
         </w:rPr>
-        <w:t>node_strength_cohort.csv</w:t>
-      </w:r>
-      <w:r>
-        <w:t xml:space="preserve">, </w:t>
+        <w:t>strength/</w:t>
+      </w:r>
+      <w:r>
+        <w:t xml:space="preserve"> and </w:t>
       </w:r>
       <w:r>
         <w:rPr>
           <w:rFonts w:ascii="Consolas" w:hAnsi="Consolas"/>
           <w:sz w:val="20"/>
         </w:rPr>
-        <w:t>asymmetry_index_cohort.csv</w:t>
-      </w:r>
-      <w:r>
-        <w:t xml:space="preserve">, </w:t>
+        <w:t>volume/</w:t>
+      </w:r>
+      <w:r>
+        <w:t xml:space="preserve">; cross-modality comparison under </w:t>
       </w:r>
       <w:r>
         <w:rPr>
           <w:rFonts w:ascii="Consolas" w:hAnsi="Consolas"/>
           <w:sz w:val="20"/>
         </w:rPr>
-        <w:t>cohort_summary.csv</w:t>
+        <w:t>compare/strength_vs_volume_ai.csv</w:t>
       </w:r>
       <w:r>
         <w:t>.</w:t>
@@ -4956,23 +5443,35 @@
                 <w:rFonts w:ascii="Consolas" w:hAnsi="Consolas"/>
                 <w:sz w:val="20"/>
               </w:rPr>
-              <w:t>_ai.csv</w:t>
-            </w:r>
-            <w:r>
-              <w:t xml:space="preserve">, </w:t>
+              <w:t>strength/per_subject/sub-XXX_ai.csv</w:t>
+            </w:r>
+          </w:p>
+        </w:tc>
+        <w:tc>
+          <w:tcPr>
+            <w:tcW w:type="dxa" w:w="2880"/>
+          </w:tcPr>
+          <w:p>
+            <w:r>
+              <w:rPr>
+                <w:b/>
+              </w:rPr>
+              <w:t>Done</w:t>
+            </w:r>
+            <w:r>
+              <w:t xml:space="preserve"> — </w:t>
             </w:r>
             <w:r>
               <w:rPr>
                 <w:rFonts w:ascii="Consolas" w:hAnsi="Consolas"/>
                 <w:sz w:val="20"/>
               </w:rPr>
-              <w:t>side_ai</w:t>
-            </w:r>
-            <w:r>
-              <w:t xml:space="preserve"> on strength</w:t>
-            </w:r>
-          </w:p>
-        </w:tc>
+              <w:t>volume/per_subject/sub-XXX_volume_ai.csv</w:t>
+            </w:r>
+          </w:p>
+        </w:tc>
+      </w:tr>
+      <w:tr>
         <w:tc>
           <w:tcPr>
             <w:tcW w:type="dxa" w:w="2880"/>
@@ -4982,7 +5481,45 @@
               <w:rPr>
                 <w:b/>
               </w:rPr>
-              <w:t>Not yet run</w:t>
+              <w:t>Output location</w:t>
+            </w:r>
+          </w:p>
+        </w:tc>
+        <w:tc>
+          <w:tcPr>
+            <w:tcW w:type="dxa" w:w="2880"/>
+          </w:tcPr>
+          <w:p>
+            <w:r>
+              <w:rPr>
+                <w:rFonts w:ascii="Consolas" w:hAnsi="Consolas"/>
+                <w:sz w:val="20"/>
+              </w:rPr>
+              <w:t>strength/</w:t>
+            </w:r>
+          </w:p>
+        </w:tc>
+        <w:tc>
+          <w:tcPr>
+            <w:tcW w:type="dxa" w:w="2880"/>
+          </w:tcPr>
+          <w:p>
+            <w:r>
+              <w:rPr>
+                <w:rFonts w:ascii="Consolas" w:hAnsi="Consolas"/>
+                <w:sz w:val="20"/>
+              </w:rPr>
+              <w:t>volume/</w:t>
+            </w:r>
+            <w:r>
+              <w:t xml:space="preserve">; comparison in </w:t>
+            </w:r>
+            <w:r>
+              <w:rPr>
+                <w:rFonts w:ascii="Consolas" w:hAnsi="Consolas"/>
+                <w:sz w:val="20"/>
+              </w:rPr>
+              <w:t>compare/</w:t>
             </w:r>
           </w:p>
         </w:tc>
@@ -5021,6 +5558,19 @@
           </w:tcPr>
           <w:p>
             <w:r>
+              <w:t xml:space="preserve">Same script with </w:t>
+            </w:r>
+            <w:r>
+              <w:rPr>
+                <w:rFonts w:ascii="Consolas" w:hAnsi="Consolas"/>
+                <w:sz w:val="20"/>
+              </w:rPr>
+              <w:t>--with-volume-ai</w:t>
+            </w:r>
+            <w:r>
+              <w:t xml:space="preserve">; also </w:t>
+            </w:r>
+            <w:r>
               <w:rPr>
                 <w:rFonts w:ascii="Consolas" w:hAnsi="Consolas"/>
                 <w:sz w:val="20"/>
@@ -5081,12 +5631,12 @@
         <w:pStyle w:val="Heading3"/>
       </w:pPr>
       <w:r>
-        <w:t>11.7 Planned optional step — volumetric AI after node strength</w:t>
+        <w:t>11.7 Optional step — volumetric AI after node strength</w:t>
       </w:r>
     </w:p>
     <w:p>
       <w:r>
-        <w:t xml:space="preserve">Volume AI can be added as an </w:t>
+        <w:t xml:space="preserve">Volume AI is an </w:t>
       </w:r>
       <w:r>
         <w:rPr>
@@ -5105,7 +5655,7 @@
         <w:t>run_dk_ai_cohort.py</w:t>
       </w:r>
       <w:r>
-        <w:t xml:space="preserve"> without rerunning QSIPrep, FreeSurfer, or QSIRecon:</w:t>
+        <w:t xml:space="preserve"> — no need to rerun QSIPrep, FreeSurfer, or QSIRecon:</w:t>
       </w:r>
     </w:p>
     <w:p>
@@ -5126,7 +5676,7 @@
     </w:p>
     <w:p>
       <w:r>
-        <w:t>Proposed CLI flag (not yet implemented):</w:t>
+        <w:t>CLI:</w:t>
       </w:r>
     </w:p>
     <w:p>
@@ -5152,7 +5702,7 @@
         <w:rPr>
           <w:b/>
         </w:rPr>
-        <w:t>Recommended volume source:</w:t>
+        <w:t>Volume source:</w:t>
       </w:r>
       <w:r>
         <w:t xml:space="preserve"> voxel counts in </w:t>
@@ -5165,7 +5715,7 @@
         <w:t>dk_nodes.mif</w:t>
       </w:r>
       <w:r>
-        <w:t xml:space="preserve"> (same 84-node grid as the connectome). Alternative: FreeSurfer </w:t>
+        <w:t xml:space="preserve"> (same 84-node grid as the connectome). Alternative for other workflows: FreeSurfer </w:t>
       </w:r>
       <w:r>
         <w:rPr>
@@ -5193,7 +5743,30 @@
         <w:rPr>
           <w:b/>
         </w:rPr>
-        <w:t>Planned extra outputs:</w:t>
+        <w:t>Extra outputs when `--with-volume-ai` is set</w:t>
+      </w:r>
+      <w:r>
+        <w:t xml:space="preserve"> (under </w:t>
+      </w:r>
+      <w:r>
+        <w:rPr>
+          <w:rFonts w:ascii="Consolas" w:hAnsi="Consolas"/>
+          <w:sz w:val="20"/>
+        </w:rPr>
+        <w:t>volume/</w:t>
+      </w:r>
+      <w:r>
+        <w:t xml:space="preserve"> and </w:t>
+      </w:r>
+      <w:r>
+        <w:rPr>
+          <w:rFonts w:ascii="Consolas" w:hAnsi="Consolas"/>
+          <w:sz w:val="20"/>
+        </w:rPr>
+        <w:t>compare/</w:t>
+      </w:r>
+      <w:r>
+        <w:t>):</w:t>
       </w:r>
     </w:p>
     <w:tbl>
@@ -5247,7 +5820,7 @@
                 <w:rFonts w:ascii="Consolas" w:hAnsi="Consolas"/>
                 <w:sz w:val="20"/>
               </w:rPr>
-              <w:t>node_volume_cohort.csv</w:t>
+              <w:t>volume/node_volume_cohort.csv</w:t>
             </w:r>
           </w:p>
         </w:tc>
@@ -5273,7 +5846,7 @@
                 <w:rFonts w:ascii="Consolas" w:hAnsi="Consolas"/>
                 <w:sz w:val="20"/>
               </w:rPr>
-              <w:t>volume_asymmetry_index_cohort.csv</w:t>
+              <w:t>volume/volume_asymmetry_index_cohort.csv</w:t>
             </w:r>
           </w:p>
         </w:tc>
@@ -5283,7 +5856,7 @@
           </w:tcPr>
           <w:p>
             <w:r>
-              <w:t>41 pairs × volume AI</w:t>
+              <w:t>42 pairs × volume AI</w:t>
             </w:r>
           </w:p>
         </w:tc>
@@ -5299,7 +5872,7 @@
                 <w:rFonts w:ascii="Consolas" w:hAnsi="Consolas"/>
                 <w:sz w:val="20"/>
               </w:rPr>
-              <w:t>strength_vs_volume_ai.csv</w:t>
+              <w:t>volume/cohort_volume_summary.csv</w:t>
             </w:r>
           </w:p>
         </w:tc>
@@ -5309,7 +5882,7 @@
           </w:tcPr>
           <w:p>
             <w:r>
-              <w:t>Side-by-side comparison per ROI</w:t>
+              <w:t>Per-ROI mean/SD of volume AI</w:t>
             </w:r>
           </w:p>
         </w:tc>
@@ -5325,7 +5898,7 @@
                 <w:rFonts w:ascii="Consolas" w:hAnsi="Consolas"/>
                 <w:sz w:val="20"/>
               </w:rPr>
-              <w:t>per_subject/sub-XXX_volume.csv</w:t>
+              <w:t>volume/per_subject/sub-XXX_volume.csv</w:t>
             </w:r>
           </w:p>
         </w:tc>
@@ -5351,7 +5924,7 @@
                 <w:rFonts w:ascii="Consolas" w:hAnsi="Consolas"/>
                 <w:sz w:val="20"/>
               </w:rPr>
-              <w:t>per_subject/sub-XXX_volume_ai.csv</w:t>
+              <w:t>volume/per_subject/sub-XXX_volume_ai.csv</w:t>
             </w:r>
           </w:p>
         </w:tc>
@@ -5362,12 +5935,53 @@
           <w:p>
             <w:r>
               <w:t>Per-subject volume AI</w:t>
+            </w:r>
+          </w:p>
+        </w:tc>
+      </w:tr>
+      <w:tr>
+        <w:tc>
+          <w:tcPr>
+            <w:tcW w:type="dxa" w:w="4320"/>
+          </w:tcPr>
+          <w:p>
+            <w:r>
+              <w:rPr>
+                <w:rFonts w:ascii="Consolas" w:hAnsi="Consolas"/>
+                <w:sz w:val="20"/>
+              </w:rPr>
+              <w:t>compare/strength_vs_volume_ai.csv</w:t>
+            </w:r>
+          </w:p>
+        </w:tc>
+        <w:tc>
+          <w:tcPr>
+            <w:tcW w:type="dxa" w:w="4320"/>
+          </w:tcPr>
+          <w:p>
+            <w:r>
+              <w:t>Side-by-side comparison per ROI</w:t>
             </w:r>
           </w:p>
         </w:tc>
       </w:tr>
     </w:tbl>
     <w:p/>
+    <w:p>
+      <w:r>
+        <w:t xml:space="preserve">Subjects without </w:t>
+      </w:r>
+      <w:r>
+        <w:rPr>
+          <w:rFonts w:ascii="Consolas" w:hAnsi="Consolas"/>
+          <w:sz w:val="20"/>
+        </w:rPr>
+        <w:t>dk_nodes.mif</w:t>
+      </w:r>
+      <w:r>
+        <w:t xml:space="preserve"> are skipped for volume with a warning; strength outputs are still written.</w:t>
+      </w:r>
+    </w:p>
     <w:p>
       <w:r>
         <w:rPr>
@@ -5404,7 +6018,7 @@
           <w:rFonts w:ascii="Consolas" w:hAnsi="Consolas"/>
           <w:sz w:val="20"/>
         </w:rPr>
-        <w:t>per_subject/sub-TBI011204_strength.csv</w:t>
+        <w:t>strength/per_subject/sub-TBI011204_strength.csv</w:t>
       </w:r>
       <w:r>
         <w:t xml:space="preserve"> and </w:t>
@@ -5460,7 +6074,7 @@
           <w:rFonts w:ascii="Consolas" w:hAnsi="Consolas"/>
           <w:sz w:val="20"/>
         </w:rPr>
-        <w:t>node_strength_cohort.csv</w:t>
+        <w:t>strength/node_strength_cohort.csv</w:t>
       </w:r>
       <w:r>
         <w:t xml:space="preserve"> and</w:t>
@@ -5472,7 +6086,7 @@
           <w:rFonts w:ascii="Consolas" w:hAnsi="Consolas"/>
           <w:sz w:val="20"/>
         </w:rPr>
-        <w:t>asymmetry_index_cohort.csv</w:t>
+        <w:t>strength/asymmetry_index_cohort.csv</w:t>
       </w:r>
       <w:r>
         <w:t>; append new rows.</w:t>
@@ -5490,7 +6104,7 @@
           <w:rFonts w:ascii="Consolas" w:hAnsi="Consolas"/>
           <w:sz w:val="20"/>
         </w:rPr>
-        <w:t>cohort_summary.csv</w:t>
+        <w:t>strength/cohort_summary.csv</w:t>
       </w:r>
       <w:r>
         <w:t>.</w:t>
@@ -5838,7 +6452,27 @@
         <w:t>Q: Is interhemispheric AI the same as volumetric AI?</w:t>
       </w:r>
       <w:r>
-        <w:t xml:space="preserve"> A: Same formula and left–right comparison; different underlying quantity (strength vs volume). You have strength AI now; volume AI is a planned add-on.</w:t>
+        <w:t xml:space="preserve"> A: Same formula and left–right comparison; different underlying quantity (strength vs volume). Strength AI lives in </w:t>
+      </w:r>
+      <w:r>
+        <w:rPr>
+          <w:rFonts w:ascii="Consolas" w:hAnsi="Consolas"/>
+          <w:sz w:val="20"/>
+        </w:rPr>
+        <w:t>strength/per_subject/sub-XXX_ai.csv</w:t>
+      </w:r>
+      <w:r>
+        <w:t xml:space="preserve">; volume AI in </w:t>
+      </w:r>
+      <w:r>
+        <w:rPr>
+          <w:rFonts w:ascii="Consolas" w:hAnsi="Consolas"/>
+          <w:sz w:val="20"/>
+        </w:rPr>
+        <w:t>volume/per_subject/sub-XXX_volume_ai.csv</w:t>
+      </w:r>
+      <w:r>
+        <w:t>.</w:t>
       </w:r>
     </w:p>
     <w:p>
@@ -5858,7 +6492,7 @@
         <w:t>node strength</w:t>
       </w:r>
       <w:r>
-        <w:t xml:space="preserve"> — 41 L/R pairs with </w:t>
+        <w:t xml:space="preserve"> — 42 L/R pairs with </w:t>
       </w:r>
       <w:r>
         <w:rPr>
@@ -5878,6 +6512,16 @@
         <w:t>log_ai</w:t>
       </w:r>
       <w:r>
+        <w:t xml:space="preserve">, under </w:t>
+      </w:r>
+      <w:r>
+        <w:rPr>
+          <w:rFonts w:ascii="Consolas" w:hAnsi="Consolas"/>
+          <w:sz w:val="20"/>
+        </w:rPr>
+        <w:t>strength/per_subject/</w:t>
+      </w:r>
+      <w:r>
         <w:t>.</w:t>
       </w:r>
     </w:p>
@@ -5899,17 +6543,37 @@
         <w:t>.../dwi_test2/node_strength_results/</w:t>
       </w:r>
       <w:r>
-        <w:t xml:space="preserve"> (formerly </w:t>
+        <w:t xml:space="preserve"> with subfolders </w:t>
       </w:r>
       <w:r>
         <w:rPr>
           <w:rFonts w:ascii="Consolas" w:hAnsi="Consolas"/>
           <w:sz w:val="20"/>
         </w:rPr>
-        <w:t>AI_results</w:t>
-      </w:r>
-      <w:r>
-        <w:t>).</w:t>
+        <w:t>strength/</w:t>
+      </w:r>
+      <w:r>
+        <w:t xml:space="preserve">, </w:t>
+      </w:r>
+      <w:r>
+        <w:rPr>
+          <w:rFonts w:ascii="Consolas" w:hAnsi="Consolas"/>
+          <w:sz w:val="20"/>
+        </w:rPr>
+        <w:t>volume/</w:t>
+      </w:r>
+      <w:r>
+        <w:t xml:space="preserve"> (optional), and </w:t>
+      </w:r>
+      <w:r>
+        <w:rPr>
+          <w:rFonts w:ascii="Consolas" w:hAnsi="Consolas"/>
+          <w:sz w:val="20"/>
+        </w:rPr>
+        <w:t>compare/</w:t>
+      </w:r>
+      <w:r>
+        <w:t xml:space="preserve"> (optional).</w:t>
       </w:r>
     </w:p>
     <w:p>
@@ -5920,17 +6584,17 @@
         <w:t>Q: Can we compare strength AI to volume AI?</w:t>
       </w:r>
       <w:r>
-        <w:t xml:space="preserve"> A: Yes, scientifically sound at the ROI level once volume AI is computed from </w:t>
+        <w:t xml:space="preserve"> A: Yes — see </w:t>
       </w:r>
       <w:r>
         <w:rPr>
           <w:rFonts w:ascii="Consolas" w:hAnsi="Consolas"/>
           <w:sz w:val="20"/>
         </w:rPr>
-        <w:t>dk_nodes.mif</w:t>
-      </w:r>
-      <w:r>
-        <w:t>; expect complementary rather than identical signals.</w:t>
+        <w:t>compare/strength_vs_volume_ai.csv</w:t>
+      </w:r>
+      <w:r>
+        <w:t xml:space="preserve"> (one row per subject × ROI pair with both modalities side by side). Expect complementary rather than identical signals.</w:t>
       </w:r>
     </w:p>
     <w:p>
@@ -5949,12 +6613,42 @@
         <w:pStyle w:val="Heading2"/>
       </w:pPr>
       <w:r>
-        <w:t>12. Per-subject output reference — `_strength.csv` and `_ai.csv`</w:t>
+        <w:t>12. Per-subject output reference — strength and volume files</w:t>
       </w:r>
     </w:p>
     <w:p>
       <w:r>
-        <w:t>This section is the authoritative description of the two core DK cohort output files. It covers definitions, upstream inputs, credible sources, how the files relate to each other, interpretation, and explicit limitations.</w:t>
+        <w:t xml:space="preserve">This section is the authoritative description of DK cohort output files under </w:t>
+      </w:r>
+      <w:r>
+        <w:rPr>
+          <w:rFonts w:ascii="Consolas" w:hAnsi="Consolas"/>
+          <w:sz w:val="20"/>
+        </w:rPr>
+        <w:t>strength/</w:t>
+      </w:r>
+      <w:r>
+        <w:t xml:space="preserve">, </w:t>
+      </w:r>
+      <w:r>
+        <w:rPr>
+          <w:rFonts w:ascii="Consolas" w:hAnsi="Consolas"/>
+          <w:sz w:val="20"/>
+        </w:rPr>
+        <w:t>volume/</w:t>
+      </w:r>
+      <w:r>
+        <w:t xml:space="preserve">, and </w:t>
+      </w:r>
+      <w:r>
+        <w:rPr>
+          <w:rFonts w:ascii="Consolas" w:hAnsi="Consolas"/>
+          <w:sz w:val="20"/>
+        </w:rPr>
+        <w:t>compare/</w:t>
+      </w:r>
+      <w:r>
+        <w:t>. It covers definitions, upstream inputs, credible sources, how the files relate to each other, interpretation, and explicit limitations.</w:t>
       </w:r>
     </w:p>
     <w:p>
@@ -5986,15 +6680,15 @@
         <w:br/>
         <w:t xml:space="preserve">                    ▼</w:t>
         <w:br/>
-        <w:t xml:space="preserve">      per_subject/sub-XXX_strength.csv         (84 rows — one per DK node)</w:t>
+        <w:t xml:space="preserve">      strength/per_subject/sub-XXX_strength.csv   (84 rows — one per DK node)</w:t>
         <w:br/>
         <w:t xml:space="preserve">                    │</w:t>
         <w:br/>
-        <w:t xml:space="preserve">                    │  pair 41 homologous L/R ROIs (nodestrength.dk_atlas)</w:t>
+        <w:t xml:space="preserve">                    │  pair 42 homologous L/R ROIs (nodestrength.dk_atlas)</w:t>
         <w:br/>
         <w:t xml:space="preserve">                    ▼</w:t>
         <w:br/>
-        <w:t xml:space="preserve">      per_subject/sub-XXX_ai.csv               (41 rows — interhemispheric AI)</w:t>
+        <w:t xml:space="preserve">      strength/per_subject/sub-XXX_ai.csv         (42 rows — interhemispheric AI)</w:t>
       </w:r>
     </w:p>
     <w:p>
@@ -7119,7 +7813,7 @@
         <w:pStyle w:val="ListBullet"/>
       </w:pPr>
       <w:r>
-        <w:t>Not a measure of tissue volume (see planned volumetric AI, §11.7).</w:t>
+        <w:t>Not a measure of tissue volume (see volumetric AI, §12.7).</w:t>
       </w:r>
     </w:p>
     <w:p>
@@ -7625,10 +8319,10 @@
         <w:rPr>
           <w:b/>
         </w:rPr>
-        <w:t>41</w:t>
-      </w:r>
-      <w:r>
-        <w:t xml:space="preserve"> matched L/R pairs (34 cortical + 7 subcortical, including whole thalamus + cerebellum cortex). Pairing rules are in </w:t>
+        <w:t>42</w:t>
+      </w:r>
+      <w:r>
+        <w:t xml:space="preserve"> matched L/R pairs (34 cortical + 7 subcortical + 1 cerebellum cortex). Pairing rules are in </w:t>
       </w:r>
       <w:r>
         <w:rPr>
@@ -8472,12 +9166,19 @@
         <w:t>Not volumetric AI</w:t>
       </w:r>
       <w:r>
-        <w:t xml:space="preserve"> — same formula can be applied to ROI volume (§11.6), but</w:t>
+        <w:t xml:space="preserve"> — same formula is applied to ROI volume in</w:t>
       </w:r>
     </w:p>
     <w:p>
       <w:r>
-        <w:t xml:space="preserve">this file uses </w:t>
+        <w:rPr>
+          <w:rFonts w:ascii="Consolas" w:hAnsi="Consolas"/>
+          <w:sz w:val="20"/>
+        </w:rPr>
+        <w:t>_volume_ai.csv</w:t>
+      </w:r>
+      <w:r>
+        <w:t xml:space="preserve"> (§12.7); this file uses </w:t>
       </w:r>
       <w:r>
         <w:rPr>
@@ -8578,7 +9279,22 @@
         <w:pStyle w:val="Heading3"/>
       </w:pPr>
       <w:r>
-        <w:t>12.4 Relationship between the two files</w:t>
+        <w:t>12.4 Relationship between strength files</w:t>
+      </w:r>
+    </w:p>
+    <w:p>
+      <w:r>
+        <w:t xml:space="preserve">All strength paths are under </w:t>
+      </w:r>
+      <w:r>
+        <w:rPr>
+          <w:rFonts w:ascii="Consolas" w:hAnsi="Consolas"/>
+          <w:sz w:val="20"/>
+        </w:rPr>
+        <w:t>strength/</w:t>
+      </w:r>
+      <w:r>
+        <w:t>:</w:t>
       </w:r>
     </w:p>
     <w:tbl>
@@ -8645,6 +9361,49 @@
               <w:rPr>
                 <w:b/>
               </w:rPr>
+              <w:t>Location</w:t>
+            </w:r>
+          </w:p>
+        </w:tc>
+        <w:tc>
+          <w:tcPr>
+            <w:tcW w:type="dxa" w:w="2880"/>
+          </w:tcPr>
+          <w:p>
+            <w:r>
+              <w:rPr>
+                <w:rFonts w:ascii="Consolas" w:hAnsi="Consolas"/>
+                <w:sz w:val="20"/>
+              </w:rPr>
+              <w:t>strength/per_subject/</w:t>
+            </w:r>
+          </w:p>
+        </w:tc>
+        <w:tc>
+          <w:tcPr>
+            <w:tcW w:type="dxa" w:w="2880"/>
+          </w:tcPr>
+          <w:p>
+            <w:r>
+              <w:rPr>
+                <w:rFonts w:ascii="Consolas" w:hAnsi="Consolas"/>
+                <w:sz w:val="20"/>
+              </w:rPr>
+              <w:t>strength/per_subject/</w:t>
+            </w:r>
+          </w:p>
+        </w:tc>
+      </w:tr>
+      <w:tr>
+        <w:tc>
+          <w:tcPr>
+            <w:tcW w:type="dxa" w:w="2880"/>
+          </w:tcPr>
+          <w:p>
+            <w:r>
+              <w:rPr>
+                <w:b/>
+              </w:rPr>
               <w:t>Unit</w:t>
             </w:r>
           </w:p>
@@ -8700,7 +9459,7 @@
           </w:tcPr>
           <w:p>
             <w:r>
-              <w:t>41</w:t>
+              <w:t>42</w:t>
             </w:r>
           </w:p>
         </w:tc>
@@ -8957,7 +9716,7 @@
                 <w:rFonts w:ascii="Consolas" w:hAnsi="Consolas"/>
                 <w:sz w:val="20"/>
               </w:rPr>
-              <w:t>sub-XXX_strength.csv</w:t>
+              <w:t>strength/per_subject/sub-XXX_strength.csv</w:t>
             </w:r>
           </w:p>
         </w:tc>
@@ -8971,7 +9730,7 @@
                 <w:rFonts w:ascii="Consolas" w:hAnsi="Consolas"/>
                 <w:sz w:val="20"/>
               </w:rPr>
-              <w:t>node_strength_cohort.csv</w:t>
+              <w:t>strength/node_strength_cohort.csv</w:t>
             </w:r>
           </w:p>
         </w:tc>
@@ -9004,7 +9763,7 @@
                 <w:rFonts w:ascii="Consolas" w:hAnsi="Consolas"/>
                 <w:sz w:val="20"/>
               </w:rPr>
-              <w:t>sub-XXX_ai.csv</w:t>
+              <w:t>strength/per_subject/sub-XXX_ai.csv</w:t>
             </w:r>
           </w:p>
         </w:tc>
@@ -9018,7 +9777,7 @@
                 <w:rFonts w:ascii="Consolas" w:hAnsi="Consolas"/>
                 <w:sz w:val="20"/>
               </w:rPr>
-              <w:t>asymmetry_index_cohort.csv</w:t>
+              <w:t>strength/asymmetry_index_cohort.csv</w:t>
             </w:r>
           </w:p>
         </w:tc>
@@ -9034,16 +9793,6 @@
         </w:tc>
       </w:tr>
       <w:tr>
-        <w:tc>
-          <w:tcPr>
-            <w:tcW w:type="dxa" w:w="2880"/>
-          </w:tcPr>
-          <w:p>
-            <w:r>
-              <w:t>—</w:t>
-            </w:r>
-          </w:p>
-        </w:tc>
         <w:tc>
           <w:tcPr>
             <w:tcW w:type="dxa" w:w="2880"/>
@@ -9054,7 +9803,7 @@
                 <w:rFonts w:ascii="Consolas" w:hAnsi="Consolas"/>
                 <w:sz w:val="20"/>
               </w:rPr>
-              <w:t>cohort_summary.csv</w:t>
+              <w:t>volume/per_subject/sub-XXX_volume.csv</w:t>
             </w:r>
           </w:p>
         </w:tc>
@@ -9064,7 +9813,109 @@
           </w:tcPr>
           <w:p>
             <w:r>
-              <w:t xml:space="preserve">Per-ROI mean/SD of </w:t>
+              <w:rPr>
+                <w:rFonts w:ascii="Consolas" w:hAnsi="Consolas"/>
+                <w:sz w:val="20"/>
+              </w:rPr>
+              <w:t>volume/node_volume_cohort.csv</w:t>
+            </w:r>
+          </w:p>
+        </w:tc>
+        <w:tc>
+          <w:tcPr>
+            <w:tcW w:type="dxa" w:w="2880"/>
+          </w:tcPr>
+          <w:p>
+            <w:r>
+              <w:t xml:space="preserve">All subjects stacked </w:t>
+            </w:r>
+            <w:r>
+              <w:rPr>
+                <w:i/>
+              </w:rPr>
+              <w:t>(with `--with-volume-ai`)</w:t>
+            </w:r>
+          </w:p>
+        </w:tc>
+      </w:tr>
+      <w:tr>
+        <w:tc>
+          <w:tcPr>
+            <w:tcW w:type="dxa" w:w="2880"/>
+          </w:tcPr>
+          <w:p>
+            <w:r>
+              <w:rPr>
+                <w:rFonts w:ascii="Consolas" w:hAnsi="Consolas"/>
+                <w:sz w:val="20"/>
+              </w:rPr>
+              <w:t>volume/per_subject/sub-XXX_volume_ai.csv</w:t>
+            </w:r>
+          </w:p>
+        </w:tc>
+        <w:tc>
+          <w:tcPr>
+            <w:tcW w:type="dxa" w:w="2880"/>
+          </w:tcPr>
+          <w:p>
+            <w:r>
+              <w:rPr>
+                <w:rFonts w:ascii="Consolas" w:hAnsi="Consolas"/>
+                <w:sz w:val="20"/>
+              </w:rPr>
+              <w:t>volume/volume_asymmetry_index_cohort.csv</w:t>
+            </w:r>
+          </w:p>
+        </w:tc>
+        <w:tc>
+          <w:tcPr>
+            <w:tcW w:type="dxa" w:w="2880"/>
+          </w:tcPr>
+          <w:p>
+            <w:r>
+              <w:t xml:space="preserve">All subjects stacked </w:t>
+            </w:r>
+            <w:r>
+              <w:rPr>
+                <w:i/>
+              </w:rPr>
+              <w:t>(with `--with-volume-ai`)</w:t>
+            </w:r>
+          </w:p>
+        </w:tc>
+      </w:tr>
+      <w:tr>
+        <w:tc>
+          <w:tcPr>
+            <w:tcW w:type="dxa" w:w="2880"/>
+          </w:tcPr>
+          <w:p>
+            <w:r>
+              <w:t>—</w:t>
+            </w:r>
+          </w:p>
+        </w:tc>
+        <w:tc>
+          <w:tcPr>
+            <w:tcW w:type="dxa" w:w="2880"/>
+          </w:tcPr>
+          <w:p>
+            <w:r>
+              <w:rPr>
+                <w:rFonts w:ascii="Consolas" w:hAnsi="Consolas"/>
+                <w:sz w:val="20"/>
+              </w:rPr>
+              <w:t>strength/cohort_summary.csv</w:t>
+            </w:r>
+          </w:p>
+        </w:tc>
+        <w:tc>
+          <w:tcPr>
+            <w:tcW w:type="dxa" w:w="2880"/>
+          </w:tcPr>
+          <w:p>
+            <w:r>
+              <w:t xml:space="preserve">Per-ROI mean/SD of strength </w:t>
             </w:r>
             <w:r>
               <w:rPr>
@@ -9083,8 +9934,94 @@
               </w:rPr>
               <w:t>log_ai</w:t>
             </w:r>
-            <w:r>
-              <w:t xml:space="preserve"> across subjects</w:t>
+          </w:p>
+        </w:tc>
+      </w:tr>
+      <w:tr>
+        <w:tc>
+          <w:tcPr>
+            <w:tcW w:type="dxa" w:w="2880"/>
+          </w:tcPr>
+          <w:p>
+            <w:r>
+              <w:t>—</w:t>
+            </w:r>
+          </w:p>
+        </w:tc>
+        <w:tc>
+          <w:tcPr>
+            <w:tcW w:type="dxa" w:w="2880"/>
+          </w:tcPr>
+          <w:p>
+            <w:r>
+              <w:rPr>
+                <w:rFonts w:ascii="Consolas" w:hAnsi="Consolas"/>
+                <w:sz w:val="20"/>
+              </w:rPr>
+              <w:t>volume/cohort_volume_summary.csv</w:t>
+            </w:r>
+          </w:p>
+        </w:tc>
+        <w:tc>
+          <w:tcPr>
+            <w:tcW w:type="dxa" w:w="2880"/>
+          </w:tcPr>
+          <w:p>
+            <w:r>
+              <w:t xml:space="preserve">Per-ROI mean/SD of volume </w:t>
+            </w:r>
+            <w:r>
+              <w:rPr>
+                <w:rFonts w:ascii="Consolas" w:hAnsi="Consolas"/>
+                <w:sz w:val="20"/>
+              </w:rPr>
+              <w:t>side_ai</w:t>
+            </w:r>
+            <w:r>
+              <w:t xml:space="preserve"> and </w:t>
+            </w:r>
+            <w:r>
+              <w:rPr>
+                <w:rFonts w:ascii="Consolas" w:hAnsi="Consolas"/>
+                <w:sz w:val="20"/>
+              </w:rPr>
+              <w:t>log_ai</w:t>
+            </w:r>
+          </w:p>
+        </w:tc>
+      </w:tr>
+      <w:tr>
+        <w:tc>
+          <w:tcPr>
+            <w:tcW w:type="dxa" w:w="2880"/>
+          </w:tcPr>
+          <w:p>
+            <w:r>
+              <w:t>—</w:t>
+            </w:r>
+          </w:p>
+        </w:tc>
+        <w:tc>
+          <w:tcPr>
+            <w:tcW w:type="dxa" w:w="2880"/>
+          </w:tcPr>
+          <w:p>
+            <w:r>
+              <w:rPr>
+                <w:rFonts w:ascii="Consolas" w:hAnsi="Consolas"/>
+                <w:sz w:val="20"/>
+              </w:rPr>
+              <w:t>compare/strength_vs_volume_ai.csv</w:t>
+            </w:r>
+          </w:p>
+        </w:tc>
+        <w:tc>
+          <w:tcPr>
+            <w:tcW w:type="dxa" w:w="2880"/>
+          </w:tcPr>
+          <w:p>
+            <w:r>
+              <w:t>Side-by-side strength AI vs volume AI per ROI</w:t>
             </w:r>
           </w:p>
         </w:tc>
@@ -9096,7 +10033,482 @@
         <w:pStyle w:val="Heading3"/>
       </w:pPr>
       <w:r>
-        <w:t>12.6 Making results more paper-faithful</w:t>
+        <w:t>12.7 `sub-XXX_volume.csv` and `sub-XXX_volume_ai.csv` *(optional)*</w:t>
+      </w:r>
+    </w:p>
+    <w:p>
+      <w:r>
+        <w:t xml:space="preserve">When </w:t>
+      </w:r>
+      <w:r>
+        <w:rPr>
+          <w:rFonts w:ascii="Consolas" w:hAnsi="Consolas"/>
+          <w:sz w:val="20"/>
+        </w:rPr>
+        <w:t>run_dk_ai_cohort.py</w:t>
+      </w:r>
+      <w:r>
+        <w:t xml:space="preserve"> is run with </w:t>
+      </w:r>
+      <w:r>
+        <w:rPr>
+          <w:rFonts w:ascii="Consolas" w:hAnsi="Consolas"/>
+          <w:sz w:val="20"/>
+        </w:rPr>
+        <w:t>--with-volume-ai</w:t>
+      </w:r>
+      <w:r>
+        <w:t xml:space="preserve">, two additional per-subject files are written from </w:t>
+      </w:r>
+      <w:r>
+        <w:rPr>
+          <w:rFonts w:ascii="Consolas" w:hAnsi="Consolas"/>
+          <w:sz w:val="20"/>
+        </w:rPr>
+        <w:t>dk_nodes.mif</w:t>
+      </w:r>
+      <w:r>
+        <w:t>:</w:t>
+      </w:r>
+    </w:p>
+    <w:p>
+      <w:pPr>
+        <w:ind w:left="360"/>
+      </w:pPr>
+      <w:r>
+        <w:rPr>
+          <w:rFonts w:ascii="Consolas" w:hAnsi="Consolas"/>
+          <w:sz w:val="18"/>
+        </w:rPr>
+        <w:t>dk_connectomes/sub-XXX/dk_nodes.mif   (84 labels on tractography grid)</w:t>
+        <w:br/>
+        <w:t xml:space="preserve">                    │</w:t>
+        <w:br/>
+        <w:t xml:space="preserve">                    ▼</w:t>
+        <w:br/>
+        <w:t xml:space="preserve">         voxel count × voxel size (nodestrength.dk_atlas)</w:t>
+        <w:br/>
+        <w:t xml:space="preserve">                    │</w:t>
+        <w:br/>
+        <w:t xml:space="preserve">                    ▼</w:t>
+        <w:br/>
+        <w:t xml:space="preserve">      volume/per_subject/sub-XXX_volume.csv       (84 rows — volume_mm3 per node)</w:t>
+        <w:br/>
+        <w:t xml:space="preserve">                    │</w:t>
+        <w:br/>
+        <w:t xml:space="preserve">                    ▼</w:t>
+        <w:br/>
+        <w:t xml:space="preserve">      volume/per_subject/sub-XXX_volume_ai.csv    (42 rows — interhemispheric AI on volume)</w:t>
+      </w:r>
+    </w:p>
+    <w:p>
+      <w:r>
+        <w:rPr>
+          <w:b/>
+        </w:rPr>
+        <w:t>Volume source:</w:t>
+      </w:r>
+      <w:r>
+        <w:t xml:space="preserve"> </w:t>
+      </w:r>
+      <w:r>
+        <w:rPr>
+          <w:rFonts w:ascii="Consolas" w:hAnsi="Consolas"/>
+          <w:sz w:val="20"/>
+        </w:rPr>
+        <w:t>dk_nodes.mif</w:t>
+      </w:r>
+      <w:r>
+        <w:t xml:space="preserve"> on the QSIPrep/QSIRecon tractography grid — same 84-node label space as </w:t>
+      </w:r>
+      <w:r>
+        <w:rPr>
+          <w:rFonts w:ascii="Consolas" w:hAnsi="Consolas"/>
+          <w:sz w:val="20"/>
+        </w:rPr>
+        <w:t>tck2connectome</w:t>
+      </w:r>
+      <w:r>
+        <w:t xml:space="preserve">. Not interchangeable with FreeSurfer </w:t>
+      </w:r>
+      <w:r>
+        <w:rPr>
+          <w:rFonts w:ascii="Consolas" w:hAnsi="Consolas"/>
+          <w:sz w:val="20"/>
+        </w:rPr>
+        <w:t>segstats</w:t>
+      </w:r>
+      <w:r>
+        <w:t xml:space="preserve"> volumes (different voxel grid).</w:t>
+      </w:r>
+    </w:p>
+    <w:p>
+      <w:r>
+        <w:rPr>
+          <w:b/>
+        </w:rPr>
+        <w:t>`_volume.csv` columns:</w:t>
+      </w:r>
+      <w:r>
+        <w:t xml:space="preserve"> same identity columns as </w:t>
+      </w:r>
+      <w:r>
+        <w:rPr>
+          <w:rFonts w:ascii="Consolas" w:hAnsi="Consolas"/>
+          <w:sz w:val="20"/>
+        </w:rPr>
+        <w:t>_strength.csv</w:t>
+      </w:r>
+      <w:r>
+        <w:t xml:space="preserve">, with </w:t>
+      </w:r>
+      <w:r>
+        <w:rPr>
+          <w:rFonts w:ascii="Consolas" w:hAnsi="Consolas"/>
+          <w:sz w:val="20"/>
+        </w:rPr>
+        <w:t>volume_mm3</w:t>
+      </w:r>
+      <w:r>
+        <w:t xml:space="preserve"> instead of </w:t>
+      </w:r>
+      <w:r>
+        <w:rPr>
+          <w:rFonts w:ascii="Consolas" w:hAnsi="Consolas"/>
+          <w:sz w:val="20"/>
+        </w:rPr>
+        <w:t>strength</w:t>
+      </w:r>
+      <w:r>
+        <w:t>.</w:t>
+      </w:r>
+    </w:p>
+    <w:p>
+      <w:r>
+        <w:rPr>
+          <w:b/>
+        </w:rPr>
+        <w:t>`_volume_ai.csv` columns:</w:t>
+      </w:r>
+      <w:r>
+        <w:t xml:space="preserve"> same pairing as </w:t>
+      </w:r>
+      <w:r>
+        <w:rPr>
+          <w:rFonts w:ascii="Consolas" w:hAnsi="Consolas"/>
+          <w:sz w:val="20"/>
+        </w:rPr>
+        <w:t>_ai.csv</w:t>
+      </w:r>
+      <w:r>
+        <w:t xml:space="preserve">, with </w:t>
+      </w:r>
+      <w:r>
+        <w:rPr>
+          <w:rFonts w:ascii="Consolas" w:hAnsi="Consolas"/>
+          <w:sz w:val="20"/>
+        </w:rPr>
+        <w:t>L_volume_mm3</w:t>
+      </w:r>
+      <w:r>
+        <w:t xml:space="preserve">, </w:t>
+      </w:r>
+      <w:r>
+        <w:rPr>
+          <w:rFonts w:ascii="Consolas" w:hAnsi="Consolas"/>
+          <w:sz w:val="20"/>
+        </w:rPr>
+        <w:t>R_volume_mm3</w:t>
+      </w:r>
+      <w:r>
+        <w:t xml:space="preserve">, </w:t>
+      </w:r>
+      <w:r>
+        <w:rPr>
+          <w:rFonts w:ascii="Consolas" w:hAnsi="Consolas"/>
+          <w:sz w:val="20"/>
+        </w:rPr>
+        <w:t>side_ai</w:t>
+      </w:r>
+      <w:r>
+        <w:t xml:space="preserve">, and </w:t>
+      </w:r>
+      <w:r>
+        <w:rPr>
+          <w:rFonts w:ascii="Consolas" w:hAnsi="Consolas"/>
+          <w:sz w:val="20"/>
+        </w:rPr>
+        <w:t>log_ai</w:t>
+      </w:r>
+      <w:r>
+        <w:t xml:space="preserve"> using the identical formulas as strength AI.</w:t>
+      </w:r>
+    </w:p>
+    <w:p>
+      <w:r>
+        <w:rPr>
+          <w:b/>
+        </w:rPr>
+        <w:t>Caveats:</w:t>
+      </w:r>
+      <w:r>
+        <w:t xml:space="preserve"> raw volumes (no ICV normalization); DK whole thalamus only.</w:t>
+      </w:r>
+    </w:p>
+    <w:p>
+      <w:pPr>
+        <w:pStyle w:val="Heading3"/>
+      </w:pPr>
+      <w:r>
+        <w:t>12.8 `compare/strength_vs_volume_ai.csv` *(optional)*</w:t>
+      </w:r>
+    </w:p>
+    <w:p>
+      <w:r>
+        <w:t xml:space="preserve">When both strength and volume AI are computed, the runner merges cohort AI tables into one comparison file under </w:t>
+      </w:r>
+      <w:r>
+        <w:rPr>
+          <w:rFonts w:ascii="Consolas" w:hAnsi="Consolas"/>
+          <w:sz w:val="20"/>
+        </w:rPr>
+        <w:t>compare/</w:t>
+      </w:r>
+      <w:r>
+        <w:t>:</w:t>
+      </w:r>
+    </w:p>
+    <w:tbl>
+      <w:tblPr>
+        <w:tblStyle w:val="LightGrid-Accent1"/>
+        <w:tblW w:type="auto" w:w="0"/>
+        <w:tblLook w:firstColumn="1" w:firstRow="1" w:lastColumn="0" w:lastRow="0" w:noHBand="0" w:noVBand="1" w:val="04A0"/>
+      </w:tblPr>
+      <w:tblGrid>
+        <w:gridCol w:w="4320"/>
+        <w:gridCol w:w="4320"/>
+      </w:tblGrid>
+      <w:tr>
+        <w:tc>
+          <w:tcPr>
+            <w:tcW w:type="dxa" w:w="4320"/>
+            <w:vAlign w:val="center"/>
+          </w:tcPr>
+          <w:p>
+            <w:r>
+              <w:rPr>
+                <w:b/>
+              </w:rPr>
+              <w:t>Column group</w:t>
+            </w:r>
+          </w:p>
+        </w:tc>
+        <w:tc>
+          <w:tcPr>
+            <w:tcW w:type="dxa" w:w="4320"/>
+            <w:vAlign w:val="center"/>
+          </w:tcPr>
+          <w:p>
+            <w:r>
+              <w:rPr>
+                <w:b/>
+              </w:rPr>
+              <w:t>Contents</w:t>
+            </w:r>
+          </w:p>
+        </w:tc>
+      </w:tr>
+      <w:tr>
+        <w:tc>
+          <w:tcPr>
+            <w:tcW w:type="dxa" w:w="4320"/>
+          </w:tcPr>
+          <w:p>
+            <w:r>
+              <w:t>Keys</w:t>
+            </w:r>
+          </w:p>
+        </w:tc>
+        <w:tc>
+          <w:tcPr>
+            <w:tcW w:type="dxa" w:w="4320"/>
+          </w:tcPr>
+          <w:p>
+            <w:r>
+              <w:rPr>
+                <w:rFonts w:ascii="Consolas" w:hAnsi="Consolas"/>
+                <w:sz w:val="20"/>
+              </w:rPr>
+              <w:t>subject</w:t>
+            </w:r>
+            <w:r>
+              <w:t xml:space="preserve">, </w:t>
+            </w:r>
+            <w:r>
+              <w:rPr>
+                <w:rFonts w:ascii="Consolas" w:hAnsi="Consolas"/>
+                <w:sz w:val="20"/>
+              </w:rPr>
+              <w:t>roi_name</w:t>
+            </w:r>
+            <w:r>
+              <w:t xml:space="preserve">, </w:t>
+            </w:r>
+            <w:r>
+              <w:rPr>
+                <w:rFonts w:ascii="Consolas" w:hAnsi="Consolas"/>
+                <w:sz w:val="20"/>
+              </w:rPr>
+              <w:t>region_type</w:t>
+            </w:r>
+            <w:r>
+              <w:t xml:space="preserve">, </w:t>
+            </w:r>
+            <w:r>
+              <w:rPr>
+                <w:rFonts w:ascii="Consolas" w:hAnsi="Consolas"/>
+                <w:sz w:val="20"/>
+              </w:rPr>
+              <w:t>L_index</w:t>
+            </w:r>
+            <w:r>
+              <w:t xml:space="preserve">, </w:t>
+            </w:r>
+            <w:r>
+              <w:rPr>
+                <w:rFonts w:ascii="Consolas" w:hAnsi="Consolas"/>
+                <w:sz w:val="20"/>
+              </w:rPr>
+              <w:t>R_index</w:t>
+            </w:r>
+          </w:p>
+        </w:tc>
+      </w:tr>
+      <w:tr>
+        <w:tc>
+          <w:tcPr>
+            <w:tcW w:type="dxa" w:w="4320"/>
+          </w:tcPr>
+          <w:p>
+            <w:r>
+              <w:t>Strength</w:t>
+            </w:r>
+          </w:p>
+        </w:tc>
+        <w:tc>
+          <w:tcPr>
+            <w:tcW w:type="dxa" w:w="4320"/>
+          </w:tcPr>
+          <w:p>
+            <w:r>
+              <w:rPr>
+                <w:rFonts w:ascii="Consolas" w:hAnsi="Consolas"/>
+                <w:sz w:val="20"/>
+              </w:rPr>
+              <w:t>L_strength</w:t>
+            </w:r>
+            <w:r>
+              <w:t xml:space="preserve">, </w:t>
+            </w:r>
+            <w:r>
+              <w:rPr>
+                <w:rFonts w:ascii="Consolas" w:hAnsi="Consolas"/>
+                <w:sz w:val="20"/>
+              </w:rPr>
+              <w:t>R_strength</w:t>
+            </w:r>
+            <w:r>
+              <w:t xml:space="preserve">, </w:t>
+            </w:r>
+            <w:r>
+              <w:rPr>
+                <w:rFonts w:ascii="Consolas" w:hAnsi="Consolas"/>
+                <w:sz w:val="20"/>
+              </w:rPr>
+              <w:t>strength_side_ai</w:t>
+            </w:r>
+            <w:r>
+              <w:t xml:space="preserve">, </w:t>
+            </w:r>
+            <w:r>
+              <w:rPr>
+                <w:rFonts w:ascii="Consolas" w:hAnsi="Consolas"/>
+                <w:sz w:val="20"/>
+              </w:rPr>
+              <w:t>strength_log_ai</w:t>
+            </w:r>
+          </w:p>
+        </w:tc>
+      </w:tr>
+      <w:tr>
+        <w:tc>
+          <w:tcPr>
+            <w:tcW w:type="dxa" w:w="4320"/>
+          </w:tcPr>
+          <w:p>
+            <w:r>
+              <w:t>Volume</w:t>
+            </w:r>
+          </w:p>
+        </w:tc>
+        <w:tc>
+          <w:tcPr>
+            <w:tcW w:type="dxa" w:w="4320"/>
+          </w:tcPr>
+          <w:p>
+            <w:r>
+              <w:rPr>
+                <w:rFonts w:ascii="Consolas" w:hAnsi="Consolas"/>
+                <w:sz w:val="20"/>
+              </w:rPr>
+              <w:t>L_volume_mm3</w:t>
+            </w:r>
+            <w:r>
+              <w:t xml:space="preserve">, </w:t>
+            </w:r>
+            <w:r>
+              <w:rPr>
+                <w:rFonts w:ascii="Consolas" w:hAnsi="Consolas"/>
+                <w:sz w:val="20"/>
+              </w:rPr>
+              <w:t>R_volume_mm3</w:t>
+            </w:r>
+            <w:r>
+              <w:t xml:space="preserve">, </w:t>
+            </w:r>
+            <w:r>
+              <w:rPr>
+                <w:rFonts w:ascii="Consolas" w:hAnsi="Consolas"/>
+                <w:sz w:val="20"/>
+              </w:rPr>
+              <w:t>volume_side_ai</w:t>
+            </w:r>
+            <w:r>
+              <w:t xml:space="preserve">, </w:t>
+            </w:r>
+            <w:r>
+              <w:rPr>
+                <w:rFonts w:ascii="Consolas" w:hAnsi="Consolas"/>
+                <w:sz w:val="20"/>
+              </w:rPr>
+              <w:t>volume_log_ai</w:t>
+            </w:r>
+          </w:p>
+        </w:tc>
+      </w:tr>
+    </w:tbl>
+    <w:p/>
+    <w:p>
+      <w:r>
+        <w:t>One row per subject × ROI pair (210 rows for 5 subjects × 42 pairs). Use this table for scatter plots, correlations, or screening where both modalities are relevant; it does not replace mixed GLMs on normative z-scores.</w:t>
+      </w:r>
+    </w:p>
+    <w:p>
+      <w:pPr>
+        <w:pStyle w:val="Heading3"/>
+      </w:pPr>
+      <w:r>
+        <w:t>12.9 Making results more paper-faithful</w:t>
       </w:r>
     </w:p>
     <w:p>

</xml_diff>